<commit_message>
fix: corrigir imagens, paginação e sumário do draft survey
</commit_message>
<xml_diff>
--- a/templates/draft_survey.clean.docx
+++ b/templates/draft_survey.clean.docx
@@ -1001,58 +1001,9 @@
         <w:rPr>
           <w:rFonts w:ascii="Tahoma" w:hAnsi="Tahoma" w:cs="Tahoma"/>
           <w:sz w:val="20"/>
-          <w:lang w:val="es-MX"/>
-        </w:rPr>
-      </w:pPr>
-    </w:p>
-    <w:p>
-      <w:pPr>
-        <w:pStyle w:val="SemEspaamento"/>
-        <w:rPr>
-          <w:rFonts w:ascii="Tahoma" w:hAnsi="Tahoma" w:cs="Tahoma"/>
-          <w:sz w:val="20"/>
-          <w:lang w:val="es-MX"/>
-        </w:rPr>
-      </w:pPr>
-    </w:p>
-    <w:p>
-      <w:pPr>
-        <w:pStyle w:val="SemEspaamento"/>
-        <w:rPr>
-          <w:rFonts w:ascii="Tahoma" w:hAnsi="Tahoma" w:cs="Tahoma"/>
-          <w:sz w:val="20"/>
-          <w:lang w:val="es-MX"/>
-        </w:rPr>
-      </w:pPr>
-    </w:p>
-    <w:p>
-      <w:pPr>
-        <w:pStyle w:val="SemEspaamento"/>
-        <w:rPr>
-          <w:rFonts w:ascii="Tahoma" w:hAnsi="Tahoma" w:cs="Tahoma"/>
-          <w:sz w:val="20"/>
-          <w:lang w:val="es-MX"/>
-        </w:rPr>
-      </w:pPr>
-    </w:p>
-    <w:p>
-      <w:pPr>
-        <w:pStyle w:val="SemEspaamento"/>
-        <w:rPr>
-          <w:rFonts w:ascii="Tahoma" w:hAnsi="Tahoma" w:cs="Tahoma"/>
-          <w:sz w:val="20"/>
-          <w:lang w:val="es-MX"/>
-        </w:rPr>
-      </w:pPr>
-    </w:p>
-    <w:p>
-      <w:pPr>
-        <w:pStyle w:val="SemEspaamento"/>
-        <w:rPr>
-          <w:rFonts w:ascii="Tahoma" w:hAnsi="Tahoma" w:cs="Tahoma"/>
-          <w:sz w:val="20"/>
-          <w:lang w:val="en-US"/>
-        </w:rPr>
+          <w:lang w:val="en-US"/>
+        </w:rPr>
+        <w:pageBreakBefore/>
       </w:pPr>
       <w:r>
         <w:rPr>
@@ -1089,25 +1040,27 @@
           <w:tab w:val="right" w:leader="dot" w:pos="10150"/>
         </w:tabs>
       </w:pPr>
-      <w:r>
-        <w:rPr>
-          <w:sz w:val="20"/>
-          <w:szCs w:val="20"/>
-          <w:lang w:val="en-US"/>
-        </w:rPr>
-        <w:t>Background</w:t>
-      </w:r>
-      <w:r>
-        <w:tab/>
-      </w:r>
-      <w:r>
-        <w:rPr>
-          <w:sz w:val="20"/>
-          <w:szCs w:val="20"/>
-          <w:lang w:val="en-US"/>
-        </w:rPr>
-        <w:t>{toc_s1}</w:t>
-      </w:r>
+      <w:hyperlink w:anchor="s1" w:history="1">
+        <w:r>
+          <w:rPr>
+            <w:sz w:val="20"/>
+            <w:szCs w:val="20"/>
+            <w:lang w:val="en-US"/>
+          </w:rPr>
+          <w:t>Background</w:t>
+        </w:r>
+        <w:r>
+          <w:tab/>
+        </w:r>
+        <w:r>
+          <w:rPr>
+            <w:sz w:val="20"/>
+            <w:szCs w:val="20"/>
+            <w:lang w:val="en-US"/>
+          </w:rPr>
+          <w:t>{toc_s1}</w:t>
+        </w:r>
+      </w:hyperlink>
     </w:p>
     <w:p>
       <w:pPr>
@@ -1124,23 +1077,25 @@
           <w:tab w:val="right" w:leader="dot" w:pos="10150"/>
         </w:tabs>
       </w:pPr>
-      <w:r>
-        <w:rPr>
-          <w:sz w:val="20"/>
-          <w:lang w:val="en-US"/>
-        </w:rPr>
-        <w:t>Ship’s Particulars</w:t>
-      </w:r>
-      <w:r>
-        <w:tab/>
-      </w:r>
-      <w:r>
-        <w:rPr>
-          <w:sz w:val="20"/>
-          <w:lang w:val="en-US"/>
-        </w:rPr>
-        <w:t>{toc_s2}</w:t>
-      </w:r>
+      <w:hyperlink w:anchor="s2" w:history="1">
+        <w:r>
+          <w:rPr>
+            <w:sz w:val="20"/>
+            <w:lang w:val="en-US"/>
+          </w:rPr>
+          <w:t>Ship’s Particulars</w:t>
+        </w:r>
+        <w:r>
+          <w:tab/>
+        </w:r>
+        <w:r>
+          <w:rPr>
+            <w:sz w:val="20"/>
+            <w:lang w:val="en-US"/>
+          </w:rPr>
+          <w:t>{toc_s2}</w:t>
+        </w:r>
+      </w:hyperlink>
     </w:p>
     <w:p>
       <w:pPr>
@@ -1157,23 +1112,25 @@
           <w:tab w:val="right" w:leader="dot" w:pos="10150"/>
         </w:tabs>
       </w:pPr>
-      <w:r>
-        <w:rPr>
-          <w:sz w:val="20"/>
-          <w:szCs w:val="20"/>
-        </w:rPr>
-        <w:t>Initial</w:t>
-      </w:r>
-      <w:r>
-        <w:tab/>
-      </w:r>
-      <w:r>
-        <w:rPr>
-          <w:sz w:val="20"/>
-          <w:szCs w:val="20"/>
-        </w:rPr>
-        <w:t>{toc_s3}</w:t>
-      </w:r>
+      <w:hyperlink w:anchor="s3" w:history="1">
+        <w:r>
+          <w:rPr>
+            <w:sz w:val="20"/>
+            <w:szCs w:val="20"/>
+          </w:rPr>
+          <w:t>Initial</w:t>
+        </w:r>
+        <w:r>
+          <w:tab/>
+        </w:r>
+        <w:r>
+          <w:rPr>
+            <w:sz w:val="20"/>
+            <w:szCs w:val="20"/>
+          </w:rPr>
+          <w:t>{toc_s3}</w:t>
+        </w:r>
+      </w:hyperlink>
     </w:p>
     <w:p>
       <w:pPr>
@@ -1187,23 +1144,25 @@
           <w:tab w:val="right" w:leader="dot" w:pos="10150"/>
         </w:tabs>
       </w:pPr>
-      <w:r>
-        <w:rPr>
-          <w:sz w:val="20"/>
-          <w:szCs w:val="20"/>
-        </w:rPr>
-        <w:t>3.1. Draft Readings</w:t>
-      </w:r>
-      <w:r>
-        <w:tab/>
-      </w:r>
-      <w:r>
-        <w:rPr>
-          <w:sz w:val="20"/>
-          <w:szCs w:val="20"/>
-        </w:rPr>
-        <w:t>{toc_s3_1}</w:t>
-      </w:r>
+      <w:hyperlink w:anchor="s3_1" w:history="1">
+        <w:r>
+          <w:rPr>
+            <w:sz w:val="20"/>
+            <w:szCs w:val="20"/>
+          </w:rPr>
+          <w:t>3.1. Draft Readings</w:t>
+        </w:r>
+        <w:r>
+          <w:tab/>
+        </w:r>
+        <w:r>
+          <w:rPr>
+            <w:sz w:val="20"/>
+            <w:szCs w:val="20"/>
+          </w:rPr>
+          <w:t>{toc_s3_1}</w:t>
+        </w:r>
+      </w:hyperlink>
     </w:p>
     <w:p>
       <w:pPr>
@@ -1217,23 +1176,25 @@
           <w:tab w:val="right" w:leader="dot" w:pos="10150"/>
         </w:tabs>
       </w:pPr>
-      <w:r>
-        <w:rPr>
-          <w:sz w:val="20"/>
-          <w:szCs w:val="20"/>
-        </w:rPr>
-        <w:t>3.2. Sea water density</w:t>
-      </w:r>
-      <w:r>
-        <w:tab/>
-      </w:r>
-      <w:r>
-        <w:rPr>
-          <w:sz w:val="20"/>
-          <w:szCs w:val="20"/>
-        </w:rPr>
-        <w:t>{toc_s3_2}</w:t>
-      </w:r>
+      <w:hyperlink w:anchor="s3_2" w:history="1">
+        <w:r>
+          <w:rPr>
+            <w:sz w:val="20"/>
+            <w:szCs w:val="20"/>
+          </w:rPr>
+          <w:t>3.2. Sea water density</w:t>
+        </w:r>
+        <w:r>
+          <w:tab/>
+        </w:r>
+        <w:r>
+          <w:rPr>
+            <w:sz w:val="20"/>
+            <w:szCs w:val="20"/>
+          </w:rPr>
+          <w:t>{toc_s3_2}</w:t>
+        </w:r>
+      </w:hyperlink>
     </w:p>
     <w:p>
       <w:pPr>
@@ -1248,25 +1209,27 @@
           <w:tab w:val="right" w:leader="dot" w:pos="10150"/>
         </w:tabs>
       </w:pPr>
-      <w:r>
-        <w:rPr>
-          <w:sz w:val="20"/>
-          <w:szCs w:val="20"/>
-          <w:lang w:val="en-US"/>
-        </w:rPr>
-        <w:t>3.3. Ballast water and fresh water</w:t>
-      </w:r>
-      <w:r>
-        <w:tab/>
-      </w:r>
-      <w:r>
-        <w:rPr>
-          <w:sz w:val="20"/>
-          <w:szCs w:val="20"/>
-          <w:lang w:val="en-US"/>
-        </w:rPr>
-        <w:t>{toc_s3_3}</w:t>
-      </w:r>
+      <w:hyperlink w:anchor="s3_3" w:history="1">
+        <w:r>
+          <w:rPr>
+            <w:sz w:val="20"/>
+            <w:szCs w:val="20"/>
+            <w:lang w:val="en-US"/>
+          </w:rPr>
+          <w:t>3.3. Ballast water and fresh water</w:t>
+        </w:r>
+        <w:r>
+          <w:tab/>
+        </w:r>
+        <w:r>
+          <w:rPr>
+            <w:sz w:val="20"/>
+            <w:szCs w:val="20"/>
+            <w:lang w:val="en-US"/>
+          </w:rPr>
+          <w:t>{toc_s3_3}</w:t>
+        </w:r>
+      </w:hyperlink>
     </w:p>
     <w:p>
       <w:pPr>
@@ -1281,25 +1244,27 @@
           <w:tab w:val="right" w:leader="dot" w:pos="10150"/>
         </w:tabs>
       </w:pPr>
-      <w:r>
-        <w:rPr>
-          <w:sz w:val="20"/>
-          <w:szCs w:val="20"/>
-          <w:lang w:val="en-US"/>
-        </w:rPr>
-        <w:t>3.4. Fuel R.O.B.</w:t>
-      </w:r>
-      <w:r>
-        <w:tab/>
-      </w:r>
-      <w:r>
-        <w:rPr>
-          <w:sz w:val="20"/>
-          <w:szCs w:val="20"/>
-          <w:lang w:val="en-US"/>
-        </w:rPr>
-        <w:t>{toc_s3_4}</w:t>
-      </w:r>
+      <w:hyperlink w:anchor="s3_4" w:history="1">
+        <w:r>
+          <w:rPr>
+            <w:sz w:val="20"/>
+            <w:szCs w:val="20"/>
+            <w:lang w:val="en-US"/>
+          </w:rPr>
+          <w:t>3.4. Fuel R.O.B.</w:t>
+        </w:r>
+        <w:r>
+          <w:tab/>
+        </w:r>
+        <w:r>
+          <w:rPr>
+            <w:sz w:val="20"/>
+            <w:szCs w:val="20"/>
+            <w:lang w:val="en-US"/>
+          </w:rPr>
+          <w:t>{toc_s3_4}</w:t>
+        </w:r>
+      </w:hyperlink>
     </w:p>
     <w:p>
       <w:pPr>
@@ -1314,25 +1279,27 @@
           <w:tab w:val="right" w:leader="dot" w:pos="10150"/>
         </w:tabs>
       </w:pPr>
-      <w:r>
-        <w:rPr>
-          <w:sz w:val="20"/>
-          <w:szCs w:val="20"/>
-          <w:lang w:val="en-US"/>
-        </w:rPr>
-        <w:t>3.5. Initial Draft details</w:t>
-      </w:r>
-      <w:r>
-        <w:tab/>
-      </w:r>
-      <w:r>
-        <w:rPr>
-          <w:sz w:val="20"/>
-          <w:szCs w:val="20"/>
-          <w:lang w:val="en-US"/>
-        </w:rPr>
-        <w:t>{toc_s3_5}</w:t>
-      </w:r>
+      <w:hyperlink w:anchor="s3_5" w:history="1">
+        <w:r>
+          <w:rPr>
+            <w:sz w:val="20"/>
+            <w:szCs w:val="20"/>
+            <w:lang w:val="en-US"/>
+          </w:rPr>
+          <w:t>3.5. Initial Draft details</w:t>
+        </w:r>
+        <w:r>
+          <w:tab/>
+        </w:r>
+        <w:r>
+          <w:rPr>
+            <w:sz w:val="20"/>
+            <w:szCs w:val="20"/>
+            <w:lang w:val="en-US"/>
+          </w:rPr>
+          <w:t>{toc_s3_5}</w:t>
+        </w:r>
+      </w:hyperlink>
     </w:p>
     <w:p>
       <w:pPr>
@@ -1372,23 +1339,25 @@
           <w:tab w:val="right" w:leader="dot" w:pos="10150"/>
         </w:tabs>
       </w:pPr>
-      <w:r>
-        <w:rPr>
-          <w:sz w:val="20"/>
-          <w:szCs w:val="20"/>
-        </w:rPr>
-        <w:t>Intermediate</w:t>
-      </w:r>
-      <w:r>
-        <w:tab/>
-      </w:r>
-      <w:r>
-        <w:rPr>
-          <w:sz w:val="20"/>
-          <w:szCs w:val="20"/>
-        </w:rPr>
-        <w:t>{toc_s4}</w:t>
-      </w:r>
+      <w:hyperlink w:anchor="s4" w:history="1">
+        <w:r>
+          <w:rPr>
+            <w:sz w:val="20"/>
+            <w:szCs w:val="20"/>
+          </w:rPr>
+          <w:t>Intermediate</w:t>
+        </w:r>
+        <w:r>
+          <w:tab/>
+        </w:r>
+        <w:r>
+          <w:rPr>
+            <w:sz w:val="20"/>
+            <w:szCs w:val="20"/>
+          </w:rPr>
+          <w:t>{toc_s4}</w:t>
+        </w:r>
+      </w:hyperlink>
     </w:p>
     <w:p>
       <w:pPr>
@@ -1402,23 +1371,25 @@
           <w:tab w:val="right" w:leader="dot" w:pos="10150"/>
         </w:tabs>
       </w:pPr>
-      <w:r>
-        <w:rPr>
-          <w:sz w:val="20"/>
-          <w:szCs w:val="20"/>
-        </w:rPr>
-        <w:t>4.1. Draft Readings</w:t>
-      </w:r>
-      <w:r>
-        <w:tab/>
-      </w:r>
-      <w:r>
-        <w:rPr>
-          <w:sz w:val="20"/>
-          <w:szCs w:val="20"/>
-        </w:rPr>
-        <w:t>{toc_s4_1}</w:t>
-      </w:r>
+      <w:hyperlink w:anchor="s4_1" w:history="1">
+        <w:r>
+          <w:rPr>
+            <w:sz w:val="20"/>
+            <w:szCs w:val="20"/>
+          </w:rPr>
+          <w:t>4.1. Draft Readings</w:t>
+        </w:r>
+        <w:r>
+          <w:tab/>
+        </w:r>
+        <w:r>
+          <w:rPr>
+            <w:sz w:val="20"/>
+            <w:szCs w:val="20"/>
+          </w:rPr>
+          <w:t>{toc_s4_1}</w:t>
+        </w:r>
+      </w:hyperlink>
     </w:p>
     <w:p>
       <w:pPr>
@@ -1432,23 +1403,25 @@
           <w:tab w:val="right" w:leader="dot" w:pos="10150"/>
         </w:tabs>
       </w:pPr>
-      <w:r>
-        <w:rPr>
-          <w:sz w:val="20"/>
-          <w:szCs w:val="20"/>
-        </w:rPr>
-        <w:t>4.2. Sea water density</w:t>
-      </w:r>
-      <w:r>
-        <w:tab/>
-      </w:r>
-      <w:r>
-        <w:rPr>
-          <w:sz w:val="20"/>
-          <w:szCs w:val="20"/>
-        </w:rPr>
-        <w:t>{toc_s4_2}</w:t>
-      </w:r>
+      <w:hyperlink w:anchor="s4_2" w:history="1">
+        <w:r>
+          <w:rPr>
+            <w:sz w:val="20"/>
+            <w:szCs w:val="20"/>
+          </w:rPr>
+          <w:t>4.2. Sea water density</w:t>
+        </w:r>
+        <w:r>
+          <w:tab/>
+        </w:r>
+        <w:r>
+          <w:rPr>
+            <w:sz w:val="20"/>
+            <w:szCs w:val="20"/>
+          </w:rPr>
+          <w:t>{toc_s4_2}</w:t>
+        </w:r>
+      </w:hyperlink>
     </w:p>
     <w:p>
       <w:pPr>
@@ -1463,25 +1436,27 @@
           <w:tab w:val="right" w:leader="dot" w:pos="10150"/>
         </w:tabs>
       </w:pPr>
-      <w:r>
-        <w:rPr>
-          <w:sz w:val="20"/>
-          <w:szCs w:val="20"/>
-          <w:lang w:val="en-US"/>
-        </w:rPr>
-        <w:t>4.3. Ballast water and fresh water</w:t>
-      </w:r>
-      <w:r>
-        <w:tab/>
-      </w:r>
-      <w:r>
-        <w:rPr>
-          <w:sz w:val="20"/>
-          <w:szCs w:val="20"/>
-          <w:lang w:val="en-US"/>
-        </w:rPr>
-        <w:t>{toc_s4_3}</w:t>
-      </w:r>
+      <w:hyperlink w:anchor="s4_3" w:history="1">
+        <w:r>
+          <w:rPr>
+            <w:sz w:val="20"/>
+            <w:szCs w:val="20"/>
+            <w:lang w:val="en-US"/>
+          </w:rPr>
+          <w:t>4.3. Ballast water and fresh water</w:t>
+        </w:r>
+        <w:r>
+          <w:tab/>
+        </w:r>
+        <w:r>
+          <w:rPr>
+            <w:sz w:val="20"/>
+            <w:szCs w:val="20"/>
+            <w:lang w:val="en-US"/>
+          </w:rPr>
+          <w:t>{toc_s4_3}</w:t>
+        </w:r>
+      </w:hyperlink>
     </w:p>
     <w:p>
       <w:pPr>
@@ -1496,25 +1471,27 @@
           <w:tab w:val="right" w:leader="dot" w:pos="10150"/>
         </w:tabs>
       </w:pPr>
-      <w:r>
-        <w:rPr>
-          <w:sz w:val="20"/>
-          <w:szCs w:val="20"/>
-          <w:lang w:val="en-US"/>
-        </w:rPr>
-        <w:t>4.4. Fuel R.O.B.</w:t>
-      </w:r>
-      <w:r>
-        <w:tab/>
-      </w:r>
-      <w:r>
-        <w:rPr>
-          <w:sz w:val="20"/>
-          <w:szCs w:val="20"/>
-          <w:lang w:val="en-US"/>
-        </w:rPr>
-        <w:t>{toc_s4_4}</w:t>
-      </w:r>
+      <w:hyperlink w:anchor="s4_4" w:history="1">
+        <w:r>
+          <w:rPr>
+            <w:sz w:val="20"/>
+            <w:szCs w:val="20"/>
+            <w:lang w:val="en-US"/>
+          </w:rPr>
+          <w:t>4.4. Fuel R.O.B.</w:t>
+        </w:r>
+        <w:r>
+          <w:tab/>
+        </w:r>
+        <w:r>
+          <w:rPr>
+            <w:sz w:val="20"/>
+            <w:szCs w:val="20"/>
+            <w:lang w:val="en-US"/>
+          </w:rPr>
+          <w:t>{toc_s4_4}</w:t>
+        </w:r>
+      </w:hyperlink>
     </w:p>
     <w:p>
       <w:pPr>
@@ -1529,25 +1506,27 @@
           <w:tab w:val="right" w:leader="dot" w:pos="10150"/>
         </w:tabs>
       </w:pPr>
-      <w:r>
-        <w:rPr>
-          <w:sz w:val="20"/>
-          <w:szCs w:val="20"/>
-          <w:lang w:val="en-US"/>
-        </w:rPr>
-        <w:t>4.5. Intermediate Draft Details</w:t>
-      </w:r>
-      <w:r>
-        <w:tab/>
-      </w:r>
-      <w:r>
-        <w:rPr>
-          <w:sz w:val="20"/>
-          <w:szCs w:val="20"/>
-          <w:lang w:val="en-US"/>
-        </w:rPr>
-        <w:t>{toc_s4_5}</w:t>
-      </w:r>
+      <w:hyperlink w:anchor="s4_5" w:history="1">
+        <w:r>
+          <w:rPr>
+            <w:sz w:val="20"/>
+            <w:szCs w:val="20"/>
+            <w:lang w:val="en-US"/>
+          </w:rPr>
+          <w:t>4.5. Intermediate Draft Details</w:t>
+        </w:r>
+        <w:r>
+          <w:tab/>
+        </w:r>
+        <w:r>
+          <w:rPr>
+            <w:sz w:val="20"/>
+            <w:szCs w:val="20"/>
+            <w:lang w:val="en-US"/>
+          </w:rPr>
+          <w:t>{toc_s4_5}</w:t>
+        </w:r>
+      </w:hyperlink>
     </w:p>
     <w:p>
       <w:pPr>
@@ -1586,23 +1565,25 @@
           <w:tab w:val="right" w:leader="dot" w:pos="10150"/>
         </w:tabs>
       </w:pPr>
-      <w:r>
-        <w:rPr>
-          <w:sz w:val="20"/>
-          <w:lang w:val="en-US"/>
-        </w:rPr>
-        <w:t>Final</w:t>
-      </w:r>
-      <w:r>
-        <w:tab/>
-      </w:r>
-      <w:r>
-        <w:rPr>
-          <w:sz w:val="20"/>
-          <w:lang w:val="en-US"/>
-        </w:rPr>
-        <w:t>{toc_s5}</w:t>
-      </w:r>
+      <w:hyperlink w:anchor="s5" w:history="1">
+        <w:r>
+          <w:rPr>
+            <w:sz w:val="20"/>
+            <w:lang w:val="en-US"/>
+          </w:rPr>
+          <w:t>Final</w:t>
+        </w:r>
+        <w:r>
+          <w:tab/>
+        </w:r>
+        <w:r>
+          <w:rPr>
+            <w:sz w:val="20"/>
+            <w:lang w:val="en-US"/>
+          </w:rPr>
+          <w:t>{toc_s5}</w:t>
+        </w:r>
+      </w:hyperlink>
     </w:p>
     <w:p>
       <w:pPr>
@@ -1616,23 +1597,25 @@
           <w:tab w:val="right" w:leader="dot" w:pos="10150"/>
         </w:tabs>
       </w:pPr>
-      <w:r>
-        <w:rPr>
-          <w:sz w:val="20"/>
-          <w:szCs w:val="20"/>
-        </w:rPr>
-        <w:t>{final_no}.1. Draft Readings</w:t>
-      </w:r>
-      <w:r>
-        <w:tab/>
-      </w:r>
-      <w:r>
-        <w:rPr>
-          <w:sz w:val="20"/>
-          <w:szCs w:val="20"/>
-        </w:rPr>
-        <w:t>{toc_s5_1}</w:t>
-      </w:r>
+      <w:hyperlink w:anchor="s5_1" w:history="1">
+        <w:r>
+          <w:rPr>
+            <w:sz w:val="20"/>
+            <w:szCs w:val="20"/>
+          </w:rPr>
+          <w:t>{final_no}.1. Draft Readings</w:t>
+        </w:r>
+        <w:r>
+          <w:tab/>
+        </w:r>
+        <w:r>
+          <w:rPr>
+            <w:sz w:val="20"/>
+            <w:szCs w:val="20"/>
+          </w:rPr>
+          <w:t>{toc_s5_1}</w:t>
+        </w:r>
+      </w:hyperlink>
     </w:p>
     <w:p>
       <w:pPr>
@@ -1646,23 +1629,25 @@
           <w:tab w:val="right" w:leader="dot" w:pos="10150"/>
         </w:tabs>
       </w:pPr>
-      <w:r>
-        <w:rPr>
-          <w:sz w:val="20"/>
-          <w:szCs w:val="20"/>
-        </w:rPr>
-        <w:t>{final_no}.2. Sea water density</w:t>
-      </w:r>
-      <w:r>
-        <w:tab/>
-      </w:r>
-      <w:r>
-        <w:rPr>
-          <w:sz w:val="20"/>
-          <w:szCs w:val="20"/>
-        </w:rPr>
-        <w:t>{toc_s5_2}</w:t>
-      </w:r>
+      <w:hyperlink w:anchor="s5_2" w:history="1">
+        <w:r>
+          <w:rPr>
+            <w:sz w:val="20"/>
+            <w:szCs w:val="20"/>
+          </w:rPr>
+          <w:t>{final_no}.2. Sea water density</w:t>
+        </w:r>
+        <w:r>
+          <w:tab/>
+        </w:r>
+        <w:r>
+          <w:rPr>
+            <w:sz w:val="20"/>
+            <w:szCs w:val="20"/>
+          </w:rPr>
+          <w:t>{toc_s5_2}</w:t>
+        </w:r>
+      </w:hyperlink>
     </w:p>
     <w:p>
       <w:pPr>
@@ -1677,25 +1662,27 @@
           <w:tab w:val="right" w:leader="dot" w:pos="10150"/>
         </w:tabs>
       </w:pPr>
-      <w:r>
-        <w:rPr>
-          <w:sz w:val="20"/>
-          <w:szCs w:val="20"/>
-          <w:lang w:val="en-US"/>
-        </w:rPr>
-        <w:t>{final_no}.3. Ballast water and fresh water</w:t>
-      </w:r>
-      <w:r>
-        <w:tab/>
-      </w:r>
-      <w:r>
-        <w:rPr>
-          <w:sz w:val="20"/>
-          <w:szCs w:val="20"/>
-          <w:lang w:val="en-US"/>
-        </w:rPr>
-        <w:t>{toc_s5_3}</w:t>
-      </w:r>
+      <w:hyperlink w:anchor="s5_3" w:history="1">
+        <w:r>
+          <w:rPr>
+            <w:sz w:val="20"/>
+            <w:szCs w:val="20"/>
+            <w:lang w:val="en-US"/>
+          </w:rPr>
+          <w:t>{final_no}.3. Ballast water and fresh water</w:t>
+        </w:r>
+        <w:r>
+          <w:tab/>
+        </w:r>
+        <w:r>
+          <w:rPr>
+            <w:sz w:val="20"/>
+            <w:szCs w:val="20"/>
+            <w:lang w:val="en-US"/>
+          </w:rPr>
+          <w:t>{toc_s5_3}</w:t>
+        </w:r>
+      </w:hyperlink>
     </w:p>
     <w:p>
       <w:pPr>
@@ -1710,25 +1697,27 @@
           <w:tab w:val="right" w:leader="dot" w:pos="10150"/>
         </w:tabs>
       </w:pPr>
-      <w:r>
-        <w:rPr>
-          <w:sz w:val="20"/>
-          <w:szCs w:val="20"/>
-          <w:lang w:val="en-US"/>
-        </w:rPr>
-        <w:t>{final_no}.4. Fuel R.O.B.</w:t>
-      </w:r>
-      <w:r>
-        <w:tab/>
-      </w:r>
-      <w:r>
-        <w:rPr>
-          <w:sz w:val="20"/>
-          <w:szCs w:val="20"/>
-          <w:lang w:val="en-US"/>
-        </w:rPr>
-        <w:t>{toc_s5_4}</w:t>
-      </w:r>
+      <w:hyperlink w:anchor="s5_4" w:history="1">
+        <w:r>
+          <w:rPr>
+            <w:sz w:val="20"/>
+            <w:szCs w:val="20"/>
+            <w:lang w:val="en-US"/>
+          </w:rPr>
+          <w:t>{final_no}.4. Fuel R.O.B.</w:t>
+        </w:r>
+        <w:r>
+          <w:tab/>
+        </w:r>
+        <w:r>
+          <w:rPr>
+            <w:sz w:val="20"/>
+            <w:szCs w:val="20"/>
+            <w:lang w:val="en-US"/>
+          </w:rPr>
+          <w:t>{toc_s5_4}</w:t>
+        </w:r>
+      </w:hyperlink>
     </w:p>
     <w:p>
       <w:pPr>
@@ -1743,25 +1732,27 @@
           <w:tab w:val="right" w:leader="dot" w:pos="10150"/>
         </w:tabs>
       </w:pPr>
-      <w:r>
-        <w:rPr>
-          <w:sz w:val="20"/>
-          <w:szCs w:val="20"/>
-          <w:lang w:val="en-US"/>
-        </w:rPr>
-        <w:t>{final_no}.5. Final Draft details</w:t>
-      </w:r>
-      <w:r>
-        <w:tab/>
-      </w:r>
-      <w:r>
-        <w:rPr>
-          <w:sz w:val="20"/>
-          <w:szCs w:val="20"/>
-          <w:lang w:val="en-US"/>
-        </w:rPr>
-        <w:t>{toc_s5_5}</w:t>
-      </w:r>
+      <w:hyperlink w:anchor="s5_5" w:history="1">
+        <w:r>
+          <w:rPr>
+            <w:sz w:val="20"/>
+            <w:szCs w:val="20"/>
+            <w:lang w:val="en-US"/>
+          </w:rPr>
+          <w:t>{final_no}.5. Final Draft details</w:t>
+        </w:r>
+        <w:r>
+          <w:tab/>
+        </w:r>
+        <w:r>
+          <w:rPr>
+            <w:sz w:val="20"/>
+            <w:szCs w:val="20"/>
+            <w:lang w:val="en-US"/>
+          </w:rPr>
+          <w:t>{toc_s5_5}</w:t>
+        </w:r>
+      </w:hyperlink>
     </w:p>
     <w:p>
       <w:pPr>
@@ -1780,25 +1771,27 @@
           <w:tab w:val="right" w:leader="dot" w:pos="10150"/>
         </w:tabs>
       </w:pPr>
-      <w:r>
-        <w:rPr>
-          <w:sz w:val="20"/>
-          <w:szCs w:val="20"/>
-          <w:lang w:val="en-US"/>
-        </w:rPr>
-        <w:t>Photographic Report</w:t>
-      </w:r>
-      <w:r>
-        <w:tab/>
-      </w:r>
-      <w:r>
-        <w:rPr>
-          <w:sz w:val="20"/>
-          <w:szCs w:val="20"/>
-          <w:lang w:val="en-US"/>
-        </w:rPr>
-        <w:t>{toc_s6}</w:t>
-      </w:r>
+      <w:hyperlink w:anchor="s6" w:history="1">
+        <w:r>
+          <w:rPr>
+            <w:sz w:val="20"/>
+            <w:szCs w:val="20"/>
+            <w:lang w:val="en-US"/>
+          </w:rPr>
+          <w:t>Photographic Report</w:t>
+        </w:r>
+        <w:r>
+          <w:tab/>
+        </w:r>
+        <w:r>
+          <w:rPr>
+            <w:sz w:val="20"/>
+            <w:szCs w:val="20"/>
+            <w:lang w:val="en-US"/>
+          </w:rPr>
+          <w:t>{toc_s6}</w:t>
+        </w:r>
+      </w:hyperlink>
     </w:p>
     <w:p>
       <w:pPr>
@@ -1813,25 +1806,27 @@
           <w:tab w:val="right" w:leader="dot" w:pos="10150"/>
         </w:tabs>
       </w:pPr>
-      <w:r>
-        <w:rPr>
-          <w:sz w:val="20"/>
-          <w:szCs w:val="20"/>
-          <w:lang w:val="en-US"/>
-        </w:rPr>
-        <w:t>{photo_no}.1. Initial</w:t>
-      </w:r>
-      <w:r>
-        <w:tab/>
-      </w:r>
-      <w:r>
-        <w:rPr>
-          <w:sz w:val="20"/>
-          <w:szCs w:val="20"/>
-          <w:lang w:val="en-US"/>
-        </w:rPr>
-        <w:t>{toc_s6_1}</w:t>
-      </w:r>
+      <w:hyperlink w:anchor="s6_1" w:history="1">
+        <w:r>
+          <w:rPr>
+            <w:sz w:val="20"/>
+            <w:szCs w:val="20"/>
+            <w:lang w:val="en-US"/>
+          </w:rPr>
+          <w:t>{photo_no}.1. Initial</w:t>
+        </w:r>
+        <w:r>
+          <w:tab/>
+        </w:r>
+        <w:r>
+          <w:rPr>
+            <w:sz w:val="20"/>
+            <w:szCs w:val="20"/>
+            <w:lang w:val="en-US"/>
+          </w:rPr>
+          <w:t>{toc_s6_1}</w:t>
+        </w:r>
+      </w:hyperlink>
     </w:p>
     <w:p>
       <w:pPr>
@@ -1868,25 +1863,27 @@
           <w:tab w:val="right" w:leader="dot" w:pos="10150"/>
         </w:tabs>
       </w:pPr>
-      <w:r>
-        <w:rPr>
-          <w:sz w:val="20"/>
-          <w:szCs w:val="20"/>
-          <w:lang w:val="en-US"/>
-        </w:rPr>
-        <w:t>{photo_no}.2. Intermediate</w:t>
-      </w:r>
-      <w:r>
-        <w:tab/>
-      </w:r>
-      <w:r>
-        <w:rPr>
-          <w:sz w:val="20"/>
-          <w:szCs w:val="20"/>
-          <w:lang w:val="en-US"/>
-        </w:rPr>
-        <w:t>{toc_s6_2}</w:t>
-      </w:r>
+      <w:hyperlink w:anchor="s6_2" w:history="1">
+        <w:r>
+          <w:rPr>
+            <w:sz w:val="20"/>
+            <w:szCs w:val="20"/>
+            <w:lang w:val="en-US"/>
+          </w:rPr>
+          <w:t>{photo_no}.2. Intermediate</w:t>
+        </w:r>
+        <w:r>
+          <w:tab/>
+        </w:r>
+        <w:r>
+          <w:rPr>
+            <w:sz w:val="20"/>
+            <w:szCs w:val="20"/>
+            <w:lang w:val="en-US"/>
+          </w:rPr>
+          <w:t>{toc_s6_2}</w:t>
+        </w:r>
+      </w:hyperlink>
     </w:p>
     <w:p>
       <w:pPr>
@@ -1923,25 +1920,27 @@
           <w:tab w:val="right" w:leader="dot" w:pos="10150"/>
         </w:tabs>
       </w:pPr>
-      <w:r>
-        <w:rPr>
-          <w:sz w:val="20"/>
-          <w:szCs w:val="20"/>
-          <w:lang w:val="en-US"/>
-        </w:rPr>
-        <w:t>{photo_no}.{photo_final_subno}. Final</w:t>
-      </w:r>
-      <w:r>
-        <w:tab/>
-      </w:r>
-      <w:r>
-        <w:rPr>
-          <w:sz w:val="20"/>
-          <w:szCs w:val="20"/>
-          <w:lang w:val="en-US"/>
-        </w:rPr>
-        <w:t>{toc_s6_3}</w:t>
-      </w:r>
+      <w:hyperlink w:anchor="s6_3" w:history="1">
+        <w:r>
+          <w:rPr>
+            <w:sz w:val="20"/>
+            <w:szCs w:val="20"/>
+            <w:lang w:val="en-US"/>
+          </w:rPr>
+          <w:t>{photo_no}.{photo_final_subno}. Final</w:t>
+        </w:r>
+        <w:r>
+          <w:tab/>
+        </w:r>
+        <w:r>
+          <w:rPr>
+            <w:sz w:val="20"/>
+            <w:szCs w:val="20"/>
+            <w:lang w:val="en-US"/>
+          </w:rPr>
+          <w:t>{toc_s6_3}</w:t>
+        </w:r>
+      </w:hyperlink>
     </w:p>
     <w:p>
       <w:pPr>
@@ -1959,23 +1958,25 @@
           <w:tab w:val="right" w:leader="dot" w:pos="10150"/>
         </w:tabs>
       </w:pPr>
-      <w:r>
-        <w:rPr>
-          <w:sz w:val="20"/>
-          <w:lang w:val="en-US"/>
-        </w:rPr>
-        <w:t>Attachment</w:t>
-      </w:r>
-      <w:r>
-        <w:tab/>
-      </w:r>
-      <w:r>
-        <w:rPr>
-          <w:sz w:val="20"/>
-          <w:lang w:val="en-US"/>
-        </w:rPr>
-        <w:t>{toc_s7}</w:t>
-      </w:r>
+      <w:hyperlink w:anchor="s7" w:history="1">
+        <w:r>
+          <w:rPr>
+            <w:sz w:val="20"/>
+            <w:lang w:val="en-US"/>
+          </w:rPr>
+          <w:t>Attachment</w:t>
+        </w:r>
+        <w:r>
+          <w:tab/>
+        </w:r>
+        <w:r>
+          <w:rPr>
+            <w:sz w:val="20"/>
+            <w:lang w:val="en-US"/>
+          </w:rPr>
+          <w:t>{toc_s7}</w:t>
+        </w:r>
+      </w:hyperlink>
     </w:p>
     <w:p>
       <w:pPr>
@@ -2274,6 +2275,7 @@
           <w:szCs w:val="24"/>
           <w:u w:val="none"/>
         </w:rPr>
+        <w:pageBreakBefore/>
       </w:pPr>
       <w:bookmarkStart w:id="1000" w:name="s1"/>
       <w:r>
@@ -4687,6 +4689,7 @@
           <w:noProof/>
           <w:lang w:val="en-US"/>
         </w:rPr>
+        <w:pageBreakBefore/>
       </w:pPr>
       <w:r>
         <w:rPr>
@@ -5886,6 +5889,7 @@
           <w:rFonts w:ascii="Tahoma" w:hAnsi="Tahoma" w:cs="Tahoma"/>
           <w:lang w:val="en-US"/>
         </w:rPr>
+        <w:pageBreakBefore/>
       </w:pPr>
       <w:r>
         <w:rPr>
@@ -7062,6 +7066,7 @@
           <w:rFonts w:ascii="Tahoma" w:hAnsi="Tahoma" w:cs="Tahoma"/>
           <w:lang w:val="en-US"/>
         </w:rPr>
+        <w:pageBreakBefore/>
       </w:pPr>
       <w:r>
         <w:rPr>
@@ -7131,6 +7136,7 @@
           <w:rFonts w:ascii="Tahoma" w:hAnsi="Tahoma" w:cs="Tahoma"/>
           <w:lang w:val="en-US"/>
         </w:rPr>
+        <w:keepNext/>
       </w:pPr>
       <w:bookmarkStart w:id="1021" w:name="s6_1"/>
       <w:r>
@@ -7203,6 +7209,7 @@
           <w:rFonts w:ascii="Tahoma" w:hAnsi="Tahoma" w:cs="Tahoma"/>
           <w:lang w:val="en-US"/>
         </w:rPr>
+        <w:keepNext/>
       </w:pPr>
       <w:r>
         <w:rPr>
@@ -7224,6 +7231,7 @@
           <w:rFonts w:ascii="Tahoma" w:hAnsi="Tahoma" w:cs="Tahoma"/>
           <w:lang w:val="en-US"/>
         </w:rPr>
+        <w:keepNext/>
       </w:pPr>
       <w:bookmarkStart w:id="1022" w:name="s6_2"/>
       <w:r>
@@ -7286,6 +7294,7 @@
           <w:rFonts w:ascii="Tahoma" w:hAnsi="Tahoma" w:cs="Tahoma"/>
           <w:lang w:val="en-US"/>
         </w:rPr>
+        <w:keepNext/>
       </w:pPr>
       <w:r>
         <w:rPr>
@@ -7317,6 +7326,7 @@
           <w:rFonts w:ascii="Tahoma" w:hAnsi="Tahoma" w:cs="Tahoma"/>
           <w:lang w:val="en-US"/>
         </w:rPr>
+        <w:keepNext/>
       </w:pPr>
       <w:bookmarkStart w:id="1023" w:name="s6_3"/>
       <w:r>

</xml_diff>